<commit_message>
Finished activities A1, A3, and A19 in Part 1, adding along their necessary evidences (images in their respective folders). Attended one lab session and added the activity to B4 as well as evidence to support attendance.
</commit_message>
<xml_diff>
--- a/Part-1/Part-1-Activities.docx
+++ b/Part-1/Part-1-Activities.docx
@@ -4,6 +4,7 @@
   <w:body>
     <w:p>
       <w:pPr>
+        <w:jc w:val="both"/>
         <w:rPr>
           <w:rFonts w:ascii="Times New Roman" w:hAnsi="Times New Roman" w:cs="Times New Roman"/>
           <w:b/>
@@ -20,9 +21,12 @@
           <w:sz w:val="40"/>
           <w:szCs w:val="40"/>
         </w:rPr>
-        <w:t xml:space="preserve">Part 1 </w:t>
-      </w:r>
-      <w:r>
+        <w:t xml:space="preserve">Part 1 Activities </w:t>
+      </w:r>
+    </w:p>
+    <w:p>
+      <w:pPr>
+        <w:jc w:val="both"/>
         <w:rPr>
           <w:rFonts w:ascii="Times New Roman" w:hAnsi="Times New Roman" w:cs="Times New Roman"/>
           <w:b/>
@@ -30,8 +34,7 @@
           <w:sz w:val="40"/>
           <w:szCs w:val="40"/>
         </w:rPr>
-        <w:t>A</w:t>
-      </w:r>
+      </w:pPr>
       <w:r>
         <w:rPr>
           <w:rFonts w:ascii="Times New Roman" w:hAnsi="Times New Roman" w:cs="Times New Roman"/>
@@ -40,11 +43,9 @@
           <w:sz w:val="40"/>
           <w:szCs w:val="40"/>
         </w:rPr>
-        <w:t xml:space="preserve">ctivities </w:t>
-      </w:r>
-    </w:p>
-    <w:p>
-      <w:pPr>
+        <w:t xml:space="preserve">(Due end of </w:t>
+      </w:r>
+      <w:r>
         <w:rPr>
           <w:rFonts w:ascii="Times New Roman" w:hAnsi="Times New Roman" w:cs="Times New Roman"/>
           <w:b/>
@@ -52,7 +53,8 @@
           <w:sz w:val="40"/>
           <w:szCs w:val="40"/>
         </w:rPr>
-      </w:pPr>
+        <w:t>W</w:t>
+      </w:r>
       <w:r>
         <w:rPr>
           <w:rFonts w:ascii="Times New Roman" w:hAnsi="Times New Roman" w:cs="Times New Roman"/>
@@ -61,117 +63,522 @@
           <w:sz w:val="40"/>
           <w:szCs w:val="40"/>
         </w:rPr>
-        <w:t>(</w:t>
-      </w:r>
-      <w:r>
+        <w:t>eek 6, Thursday 11.59pm AWST)</w:t>
+      </w:r>
+    </w:p>
+    <w:p>
+      <w:pPr>
+        <w:jc w:val="both"/>
+        <w:rPr>
+          <w:rFonts w:ascii="Times New Roman" w:hAnsi="Times New Roman" w:cs="Times New Roman"/>
+        </w:rPr>
+      </w:pPr>
+      <w:r>
+        <w:rPr>
+          <w:rFonts w:ascii="Times New Roman" w:hAnsi="Times New Roman" w:cs="Times New Roman"/>
+        </w:rPr>
+        <w:t xml:space="preserve">Done counter: </w:t>
+      </w:r>
+      <w:r>
+        <w:rPr>
+          <w:rFonts w:ascii="Times New Roman" w:hAnsi="Times New Roman" w:cs="Times New Roman"/>
+        </w:rPr>
+        <w:t>3</w:t>
+      </w:r>
+      <w:r>
+        <w:rPr>
+          <w:rFonts w:ascii="Times New Roman" w:hAnsi="Times New Roman" w:cs="Times New Roman"/>
+        </w:rPr>
+        <w:t>/25</w:t>
+      </w:r>
+    </w:p>
+    <w:p>
+      <w:pPr>
+        <w:jc w:val="both"/>
+        <w:rPr>
+          <w:rFonts w:ascii="Times New Roman" w:hAnsi="Times New Roman" w:cs="Times New Roman"/>
+        </w:rPr>
+      </w:pPr>
+      <w:r>
+        <w:rPr>
+          <w:rFonts w:ascii="Times New Roman" w:hAnsi="Times New Roman" w:cs="Times New Roman"/>
+        </w:rPr>
+        <w:t>Choose any 25 activities from the following list to complete and submit.</w:t>
+      </w:r>
+    </w:p>
+    <w:p>
+      <w:pPr>
+        <w:jc w:val="both"/>
+        <w:rPr>
+          <w:rFonts w:ascii="Times New Roman" w:hAnsi="Times New Roman" w:cs="Times New Roman"/>
+        </w:rPr>
+      </w:pPr>
+    </w:p>
+    <w:p>
+      <w:pPr>
+        <w:jc w:val="both"/>
         <w:rPr>
           <w:rFonts w:ascii="Times New Roman" w:hAnsi="Times New Roman" w:cs="Times New Roman"/>
           <w:b/>
           <w:bCs/>
-          <w:sz w:val="40"/>
-          <w:szCs w:val="40"/>
-        </w:rPr>
-        <w:t>D</w:t>
-      </w:r>
+        </w:rPr>
+      </w:pPr>
       <w:r>
         <w:rPr>
           <w:rFonts w:ascii="Times New Roman" w:hAnsi="Times New Roman" w:cs="Times New Roman"/>
           <w:b/>
           <w:bCs/>
-          <w:sz w:val="40"/>
-          <w:szCs w:val="40"/>
-        </w:rPr>
-        <w:t xml:space="preserve">ue end of </w:t>
-      </w:r>
-      <w:r>
+        </w:rPr>
+        <w:t>A1. Discover security concepts used on campus.</w:t>
+      </w:r>
+    </w:p>
+    <w:p>
+      <w:pPr>
+        <w:jc w:val="both"/>
+        <w:rPr>
+          <w:rFonts w:ascii="Times New Roman" w:hAnsi="Times New Roman" w:cs="Times New Roman"/>
+        </w:rPr>
+      </w:pPr>
+      <w:r>
+        <w:rPr>
+          <w:rFonts w:ascii="Times New Roman" w:hAnsi="Times New Roman" w:cs="Times New Roman"/>
+          <w:noProof/>
+        </w:rPr>
+        <w:drawing>
+          <wp:anchor distT="0" distB="0" distL="114300" distR="114300" simplePos="0" relativeHeight="251658240" behindDoc="1" locked="0" layoutInCell="1" allowOverlap="1" wp14:anchorId="1CC05912" wp14:editId="4C1377CA">
+            <wp:simplePos x="0" y="0"/>
+            <wp:positionH relativeFrom="column">
+              <wp:posOffset>52705</wp:posOffset>
+            </wp:positionH>
+            <wp:positionV relativeFrom="paragraph">
+              <wp:posOffset>42094</wp:posOffset>
+            </wp:positionV>
+            <wp:extent cx="3014980" cy="1696085"/>
+            <wp:effectExtent l="0" t="0" r="0" b="0"/>
+            <wp:wrapTight wrapText="bothSides">
+              <wp:wrapPolygon edited="0">
+                <wp:start x="0" y="0"/>
+                <wp:lineTo x="0" y="21349"/>
+                <wp:lineTo x="21427" y="21349"/>
+                <wp:lineTo x="21427" y="0"/>
+                <wp:lineTo x="0" y="0"/>
+              </wp:wrapPolygon>
+            </wp:wrapTight>
+            <wp:docPr id="772936819" name="Picture 1"/>
+            <wp:cNvGraphicFramePr>
+              <a:graphicFrameLocks xmlns:a="http://schemas.openxmlformats.org/drawingml/2006/main" noChangeAspect="1"/>
+            </wp:cNvGraphicFramePr>
+            <a:graphic xmlns:a="http://schemas.openxmlformats.org/drawingml/2006/main">
+              <a:graphicData uri="http://schemas.openxmlformats.org/drawingml/2006/picture">
+                <pic:pic xmlns:pic="http://schemas.openxmlformats.org/drawingml/2006/picture">
+                  <pic:nvPicPr>
+                    <pic:cNvPr id="0" name="Picture 1"/>
+                    <pic:cNvPicPr>
+                      <a:picLocks noChangeAspect="1" noChangeArrowheads="1"/>
+                    </pic:cNvPicPr>
+                  </pic:nvPicPr>
+                  <pic:blipFill>
+                    <a:blip r:embed="rId4" cstate="print">
+                      <a:extLst>
+                        <a:ext uri="{28A0092B-C50C-407E-A947-70E740481C1C}">
+                          <a14:useLocalDpi xmlns:a14="http://schemas.microsoft.com/office/drawing/2010/main" val="0"/>
+                        </a:ext>
+                      </a:extLst>
+                    </a:blip>
+                    <a:srcRect/>
+                    <a:stretch>
+                      <a:fillRect/>
+                    </a:stretch>
+                  </pic:blipFill>
+                  <pic:spPr bwMode="auto">
+                    <a:xfrm>
+                      <a:off x="0" y="0"/>
+                      <a:ext cx="3014980" cy="1696085"/>
+                    </a:xfrm>
+                    <a:prstGeom prst="rect">
+                      <a:avLst/>
+                    </a:prstGeom>
+                    <a:noFill/>
+                    <a:ln>
+                      <a:noFill/>
+                    </a:ln>
+                  </pic:spPr>
+                </pic:pic>
+              </a:graphicData>
+            </a:graphic>
+          </wp:anchor>
+        </w:drawing>
+      </w:r>
+      <w:r>
+        <w:rPr>
+          <w:rFonts w:ascii="Times New Roman" w:hAnsi="Times New Roman" w:cs="Times New Roman"/>
+        </w:rPr>
+        <w:t>Students and staff get a campus card which they can use for electronic access to buildings</w:t>
+      </w:r>
+      <w:r>
+        <w:rPr>
+          <w:rFonts w:ascii="Times New Roman" w:hAnsi="Times New Roman" w:cs="Times New Roman"/>
+        </w:rPr>
+        <w:t>, among its many other functions.</w:t>
+      </w:r>
+    </w:p>
+    <w:p>
+      <w:pPr>
+        <w:jc w:val="both"/>
+        <w:rPr>
+          <w:rFonts w:ascii="Times New Roman" w:hAnsi="Times New Roman" w:cs="Times New Roman"/>
+        </w:rPr>
+      </w:pPr>
+      <w:r>
+        <w:rPr>
+          <w:rFonts w:ascii="Times New Roman" w:hAnsi="Times New Roman" w:cs="Times New Roman"/>
+        </w:rPr>
+        <w:drawing>
+          <wp:anchor distT="0" distB="0" distL="114300" distR="114300" simplePos="0" relativeHeight="251659264" behindDoc="1" locked="0" layoutInCell="1" allowOverlap="1" wp14:anchorId="42DB2A78" wp14:editId="3446B9CB">
+            <wp:simplePos x="0" y="0"/>
+            <wp:positionH relativeFrom="column">
+              <wp:posOffset>52312</wp:posOffset>
+            </wp:positionH>
+            <wp:positionV relativeFrom="paragraph">
+              <wp:posOffset>969964</wp:posOffset>
+            </wp:positionV>
+            <wp:extent cx="3014980" cy="1531620"/>
+            <wp:effectExtent l="0" t="0" r="0" b="0"/>
+            <wp:wrapTight wrapText="bothSides">
+              <wp:wrapPolygon edited="0">
+                <wp:start x="0" y="0"/>
+                <wp:lineTo x="0" y="21224"/>
+                <wp:lineTo x="21427" y="21224"/>
+                <wp:lineTo x="21427" y="0"/>
+                <wp:lineTo x="0" y="0"/>
+              </wp:wrapPolygon>
+            </wp:wrapTight>
+            <wp:docPr id="1078264677" name="Picture 1"/>
+            <wp:cNvGraphicFramePr>
+              <a:graphicFrameLocks xmlns:a="http://schemas.openxmlformats.org/drawingml/2006/main" noChangeAspect="1"/>
+            </wp:cNvGraphicFramePr>
+            <a:graphic xmlns:a="http://schemas.openxmlformats.org/drawingml/2006/main">
+              <a:graphicData uri="http://schemas.openxmlformats.org/drawingml/2006/picture">
+                <pic:pic xmlns:pic="http://schemas.openxmlformats.org/drawingml/2006/picture">
+                  <pic:nvPicPr>
+                    <pic:cNvPr id="1078264677" name=""/>
+                    <pic:cNvPicPr/>
+                  </pic:nvPicPr>
+                  <pic:blipFill>
+                    <a:blip r:embed="rId5" cstate="print">
+                      <a:extLst>
+                        <a:ext uri="{28A0092B-C50C-407E-A947-70E740481C1C}">
+                          <a14:useLocalDpi xmlns:a14="http://schemas.microsoft.com/office/drawing/2010/main" val="0"/>
+                        </a:ext>
+                      </a:extLst>
+                    </a:blip>
+                    <a:stretch>
+                      <a:fillRect/>
+                    </a:stretch>
+                  </pic:blipFill>
+                  <pic:spPr>
+                    <a:xfrm>
+                      <a:off x="0" y="0"/>
+                      <a:ext cx="3014980" cy="1531620"/>
+                    </a:xfrm>
+                    <a:prstGeom prst="rect">
+                      <a:avLst/>
+                    </a:prstGeom>
+                  </pic:spPr>
+                </pic:pic>
+              </a:graphicData>
+            </a:graphic>
+            <wp14:sizeRelH relativeFrom="margin">
+              <wp14:pctWidth>0</wp14:pctWidth>
+            </wp14:sizeRelH>
+            <wp14:sizeRelV relativeFrom="margin">
+              <wp14:pctHeight>0</wp14:pctHeight>
+            </wp14:sizeRelV>
+          </wp:anchor>
+        </w:drawing>
+      </w:r>
+      <w:r>
+        <w:rPr>
+          <w:rFonts w:ascii="Times New Roman" w:hAnsi="Times New Roman" w:cs="Times New Roman"/>
+        </w:rPr>
+        <w:t>Upon further investigation, it seems that the card reader comes from the company Gallagher and specifically has the model T11 Multi Tech Reader.</w:t>
+      </w:r>
+      <w:r>
+        <w:rPr>
+          <w:rFonts w:ascii="Times New Roman" w:hAnsi="Times New Roman" w:cs="Times New Roman"/>
+        </w:rPr>
+        <w:t xml:space="preserve"> This card reader provides reader security through authentication and encryption between the reader and the controller.</w:t>
+      </w:r>
+    </w:p>
+    <w:p>
+      <w:pPr>
+        <w:jc w:val="both"/>
+        <w:rPr>
+          <w:rFonts w:ascii="Times New Roman" w:hAnsi="Times New Roman" w:cs="Times New Roman"/>
+        </w:rPr>
+      </w:pPr>
+    </w:p>
+    <w:p>
+      <w:pPr>
+        <w:jc w:val="both"/>
+        <w:rPr>
+          <w:rFonts w:ascii="Times New Roman" w:hAnsi="Times New Roman" w:cs="Times New Roman"/>
+        </w:rPr>
+      </w:pPr>
+    </w:p>
+    <w:p>
+      <w:pPr>
+        <w:jc w:val="both"/>
+        <w:rPr>
+          <w:rFonts w:ascii="Times New Roman" w:hAnsi="Times New Roman" w:cs="Times New Roman"/>
+        </w:rPr>
+      </w:pPr>
+    </w:p>
+    <w:p>
+      <w:pPr>
+        <w:jc w:val="both"/>
+        <w:rPr>
+          <w:rFonts w:ascii="Times New Roman" w:hAnsi="Times New Roman" w:cs="Times New Roman"/>
+        </w:rPr>
+      </w:pPr>
+    </w:p>
+    <w:p>
+      <w:pPr>
+        <w:jc w:val="both"/>
+        <w:rPr>
+          <w:rFonts w:ascii="Times New Roman" w:hAnsi="Times New Roman" w:cs="Times New Roman"/>
+        </w:rPr>
+      </w:pPr>
+      <w:r>
+        <w:rPr>
+          <w:rFonts w:ascii="Times New Roman" w:hAnsi="Times New Roman" w:cs="Times New Roman"/>
+        </w:rPr>
+        <w:t>A2. Discover security concepts used in public space.</w:t>
+      </w:r>
+    </w:p>
+    <w:p>
+      <w:pPr>
+        <w:jc w:val="both"/>
+        <w:rPr>
+          <w:rFonts w:ascii="Times New Roman" w:hAnsi="Times New Roman" w:cs="Times New Roman"/>
+        </w:rPr>
+      </w:pPr>
+      <w:r>
+        <w:rPr>
+          <w:rFonts w:ascii="Times New Roman" w:hAnsi="Times New Roman" w:cs="Times New Roman"/>
+        </w:rPr>
+        <w:t>Need to take pic of cctv used in woollies/coles.</w:t>
+      </w:r>
+    </w:p>
+    <w:p>
+      <w:pPr>
+        <w:jc w:val="both"/>
         <w:rPr>
           <w:rFonts w:ascii="Times New Roman" w:hAnsi="Times New Roman" w:cs="Times New Roman"/>
           <w:b/>
           <w:bCs/>
-          <w:sz w:val="40"/>
-          <w:szCs w:val="40"/>
-        </w:rPr>
-        <w:t>W</w:t>
-      </w:r>
+        </w:rPr>
+      </w:pPr>
       <w:r>
         <w:rPr>
           <w:rFonts w:ascii="Times New Roman" w:hAnsi="Times New Roman" w:cs="Times New Roman"/>
           <w:b/>
           <w:bCs/>
-          <w:sz w:val="40"/>
-          <w:szCs w:val="40"/>
-        </w:rPr>
-        <w:t>eek 6, Thursday 11.59pm AWST)</w:t>
-      </w:r>
-    </w:p>
-    <w:p>
-      <w:pPr>
-        <w:rPr>
-          <w:rFonts w:ascii="Times New Roman" w:hAnsi="Times New Roman" w:cs="Times New Roman"/>
-        </w:rPr>
-      </w:pPr>
-    </w:p>
-    <w:p>
-      <w:pPr>
-        <w:rPr>
-          <w:rFonts w:ascii="Times New Roman" w:hAnsi="Times New Roman" w:cs="Times New Roman"/>
-        </w:rPr>
-      </w:pPr>
-      <w:r>
-        <w:rPr>
-          <w:rFonts w:ascii="Times New Roman" w:hAnsi="Times New Roman" w:cs="Times New Roman"/>
-        </w:rPr>
-        <w:t>Choose any 25 activities from the following list to complete and submit.</w:t>
-      </w:r>
-    </w:p>
-    <w:p>
-      <w:pPr>
-        <w:rPr>
-          <w:rFonts w:ascii="Times New Roman" w:hAnsi="Times New Roman" w:cs="Times New Roman"/>
-        </w:rPr>
-      </w:pPr>
-    </w:p>
-    <w:p>
-      <w:pPr>
-        <w:rPr>
-          <w:rFonts w:ascii="Times New Roman" w:hAnsi="Times New Roman" w:cs="Times New Roman"/>
-        </w:rPr>
-      </w:pPr>
-      <w:r>
-        <w:rPr>
-          <w:rFonts w:ascii="Times New Roman" w:hAnsi="Times New Roman" w:cs="Times New Roman"/>
-        </w:rPr>
-        <w:t>A1. Discover security concepts used on campus.</w:t>
-      </w:r>
-    </w:p>
-    <w:p>
-      <w:pPr>
-        <w:rPr>
-          <w:rFonts w:ascii="Times New Roman" w:hAnsi="Times New Roman" w:cs="Times New Roman"/>
-        </w:rPr>
-      </w:pPr>
-      <w:r>
-        <w:rPr>
-          <w:rFonts w:ascii="Times New Roman" w:hAnsi="Times New Roman" w:cs="Times New Roman"/>
-        </w:rPr>
-        <w:t>A2. Discover security concepts used in public space.</w:t>
-      </w:r>
-    </w:p>
-    <w:p>
-      <w:pPr>
-        <w:rPr>
-          <w:rFonts w:ascii="Times New Roman" w:hAnsi="Times New Roman" w:cs="Times New Roman"/>
-        </w:rPr>
-      </w:pPr>
-      <w:r>
-        <w:rPr>
-          <w:rFonts w:ascii="Times New Roman" w:hAnsi="Times New Roman" w:cs="Times New Roman"/>
+          <w:noProof/>
+        </w:rPr>
+        <w:drawing>
+          <wp:anchor distT="0" distB="0" distL="114300" distR="114300" simplePos="0" relativeHeight="251661312" behindDoc="1" locked="0" layoutInCell="1" allowOverlap="1" wp14:anchorId="7A22396D" wp14:editId="70EF1C68">
+            <wp:simplePos x="0" y="0"/>
+            <wp:positionH relativeFrom="column">
+              <wp:posOffset>1690073</wp:posOffset>
+            </wp:positionH>
+            <wp:positionV relativeFrom="paragraph">
+              <wp:posOffset>241935</wp:posOffset>
+            </wp:positionV>
+            <wp:extent cx="1700530" cy="956310"/>
+            <wp:effectExtent l="0" t="0" r="0" b="0"/>
+            <wp:wrapTight wrapText="bothSides">
+              <wp:wrapPolygon edited="0">
+                <wp:start x="0" y="0"/>
+                <wp:lineTo x="0" y="21084"/>
+                <wp:lineTo x="21294" y="21084"/>
+                <wp:lineTo x="21294" y="0"/>
+                <wp:lineTo x="0" y="0"/>
+              </wp:wrapPolygon>
+            </wp:wrapTight>
+            <wp:docPr id="583298403" name="Picture 3"/>
+            <wp:cNvGraphicFramePr>
+              <a:graphicFrameLocks xmlns:a="http://schemas.openxmlformats.org/drawingml/2006/main" noChangeAspect="1"/>
+            </wp:cNvGraphicFramePr>
+            <a:graphic xmlns:a="http://schemas.openxmlformats.org/drawingml/2006/main">
+              <a:graphicData uri="http://schemas.openxmlformats.org/drawingml/2006/picture">
+                <pic:pic xmlns:pic="http://schemas.openxmlformats.org/drawingml/2006/picture">
+                  <pic:nvPicPr>
+                    <pic:cNvPr id="0" name="Picture 3"/>
+                    <pic:cNvPicPr>
+                      <a:picLocks noChangeAspect="1" noChangeArrowheads="1"/>
+                    </pic:cNvPicPr>
+                  </pic:nvPicPr>
+                  <pic:blipFill>
+                    <a:blip r:embed="rId6" cstate="print">
+                      <a:extLst>
+                        <a:ext uri="{28A0092B-C50C-407E-A947-70E740481C1C}">
+                          <a14:useLocalDpi xmlns:a14="http://schemas.microsoft.com/office/drawing/2010/main" val="0"/>
+                        </a:ext>
+                      </a:extLst>
+                    </a:blip>
+                    <a:srcRect/>
+                    <a:stretch>
+                      <a:fillRect/>
+                    </a:stretch>
+                  </pic:blipFill>
+                  <pic:spPr bwMode="auto">
+                    <a:xfrm>
+                      <a:off x="0" y="0"/>
+                      <a:ext cx="1700530" cy="956310"/>
+                    </a:xfrm>
+                    <a:prstGeom prst="rect">
+                      <a:avLst/>
+                    </a:prstGeom>
+                    <a:noFill/>
+                    <a:ln>
+                      <a:noFill/>
+                    </a:ln>
+                  </pic:spPr>
+                </pic:pic>
+              </a:graphicData>
+            </a:graphic>
+            <wp14:sizeRelH relativeFrom="margin">
+              <wp14:pctWidth>0</wp14:pctWidth>
+            </wp14:sizeRelH>
+            <wp14:sizeRelV relativeFrom="margin">
+              <wp14:pctHeight>0</wp14:pctHeight>
+            </wp14:sizeRelV>
+          </wp:anchor>
+        </w:drawing>
+      </w:r>
+      <w:r>
+        <w:rPr>
+          <w:rFonts w:ascii="Times New Roman" w:hAnsi="Times New Roman" w:cs="Times New Roman"/>
+          <w:b/>
+          <w:bCs/>
+          <w:noProof/>
+        </w:rPr>
+        <w:drawing>
+          <wp:anchor distT="0" distB="0" distL="114300" distR="114300" simplePos="0" relativeHeight="251660288" behindDoc="1" locked="0" layoutInCell="1" allowOverlap="1" wp14:anchorId="57F5FC1E" wp14:editId="4DDEA1B9">
+            <wp:simplePos x="0" y="0"/>
+            <wp:positionH relativeFrom="column">
+              <wp:posOffset>-195</wp:posOffset>
+            </wp:positionH>
+            <wp:positionV relativeFrom="paragraph">
+              <wp:posOffset>246674</wp:posOffset>
+            </wp:positionV>
+            <wp:extent cx="1690370" cy="951230"/>
+            <wp:effectExtent l="0" t="0" r="5080" b="1270"/>
+            <wp:wrapTight wrapText="bothSides">
+              <wp:wrapPolygon edited="0">
+                <wp:start x="0" y="0"/>
+                <wp:lineTo x="0" y="21196"/>
+                <wp:lineTo x="21421" y="21196"/>
+                <wp:lineTo x="21421" y="0"/>
+                <wp:lineTo x="0" y="0"/>
+              </wp:wrapPolygon>
+            </wp:wrapTight>
+            <wp:docPr id="1889892760" name="Picture 2"/>
+            <wp:cNvGraphicFramePr>
+              <a:graphicFrameLocks xmlns:a="http://schemas.openxmlformats.org/drawingml/2006/main" noChangeAspect="1"/>
+            </wp:cNvGraphicFramePr>
+            <a:graphic xmlns:a="http://schemas.openxmlformats.org/drawingml/2006/main">
+              <a:graphicData uri="http://schemas.openxmlformats.org/drawingml/2006/picture">
+                <pic:pic xmlns:pic="http://schemas.openxmlformats.org/drawingml/2006/picture">
+                  <pic:nvPicPr>
+                    <pic:cNvPr id="0" name="Picture 2"/>
+                    <pic:cNvPicPr>
+                      <a:picLocks noChangeAspect="1" noChangeArrowheads="1"/>
+                    </pic:cNvPicPr>
+                  </pic:nvPicPr>
+                  <pic:blipFill>
+                    <a:blip r:embed="rId7" cstate="print">
+                      <a:extLst>
+                        <a:ext uri="{28A0092B-C50C-407E-A947-70E740481C1C}">
+                          <a14:useLocalDpi xmlns:a14="http://schemas.microsoft.com/office/drawing/2010/main" val="0"/>
+                        </a:ext>
+                      </a:extLst>
+                    </a:blip>
+                    <a:srcRect/>
+                    <a:stretch>
+                      <a:fillRect/>
+                    </a:stretch>
+                  </pic:blipFill>
+                  <pic:spPr bwMode="auto">
+                    <a:xfrm>
+                      <a:off x="0" y="0"/>
+                      <a:ext cx="1690370" cy="951230"/>
+                    </a:xfrm>
+                    <a:prstGeom prst="rect">
+                      <a:avLst/>
+                    </a:prstGeom>
+                    <a:noFill/>
+                    <a:ln>
+                      <a:noFill/>
+                    </a:ln>
+                  </pic:spPr>
+                </pic:pic>
+              </a:graphicData>
+            </a:graphic>
+          </wp:anchor>
+        </w:drawing>
+      </w:r>
+      <w:r>
+        <w:rPr>
+          <w:rFonts w:ascii="Times New Roman" w:hAnsi="Times New Roman" w:cs="Times New Roman"/>
+          <w:b/>
+          <w:bCs/>
         </w:rPr>
         <w:t>A3. Discover security concepts used in your house.</w:t>
       </w:r>
     </w:p>
     <w:p>
       <w:pPr>
+        <w:jc w:val="both"/>
+        <w:rPr>
+          <w:rFonts w:ascii="Times New Roman" w:hAnsi="Times New Roman" w:cs="Times New Roman"/>
+        </w:rPr>
+      </w:pPr>
+      <w:r>
+        <w:rPr>
+          <w:rFonts w:ascii="Times New Roman" w:hAnsi="Times New Roman" w:cs="Times New Roman"/>
+        </w:rPr>
+        <w:t>My house uses CCTV to monitor the outside of the house and the kitchen. The security camera comes from the company ANRAN</w:t>
+      </w:r>
+      <w:r>
+        <w:rPr>
+          <w:rFonts w:ascii="Times New Roman" w:hAnsi="Times New Roman" w:cs="Times New Roman"/>
+        </w:rPr>
+        <w:t>, which is known to offer</w:t>
+      </w:r>
+      <w:r>
+        <w:rPr>
+          <w:rFonts w:ascii="Times New Roman" w:hAnsi="Times New Roman" w:cs="Times New Roman"/>
+        </w:rPr>
+        <w:t xml:space="preserve"> smart</w:t>
+      </w:r>
+      <w:r>
+        <w:rPr>
+          <w:rFonts w:ascii="Times New Roman" w:hAnsi="Times New Roman" w:cs="Times New Roman"/>
+        </w:rPr>
+        <w:t xml:space="preserve"> surveillance systems</w:t>
+      </w:r>
+      <w:r>
+        <w:rPr>
+          <w:rFonts w:ascii="Times New Roman" w:hAnsi="Times New Roman" w:cs="Times New Roman"/>
+        </w:rPr>
+        <w:t>.</w:t>
+      </w:r>
+    </w:p>
+    <w:p>
+      <w:pPr>
+        <w:jc w:val="both"/>
         <w:rPr>
           <w:rFonts w:ascii="Times New Roman" w:hAnsi="Times New Roman" w:cs="Times New Roman"/>
         </w:rPr>
@@ -185,6 +592,7 @@
     </w:p>
     <w:p>
       <w:pPr>
+        <w:jc w:val="both"/>
         <w:rPr>
           <w:rFonts w:ascii="Times New Roman" w:hAnsi="Times New Roman" w:cs="Times New Roman"/>
         </w:rPr>
@@ -198,6 +606,7 @@
     </w:p>
     <w:p>
       <w:pPr>
+        <w:jc w:val="both"/>
         <w:rPr>
           <w:rFonts w:ascii="Times New Roman" w:hAnsi="Times New Roman" w:cs="Times New Roman"/>
         </w:rPr>
@@ -211,6 +620,7 @@
     </w:p>
     <w:p>
       <w:pPr>
+        <w:jc w:val="both"/>
         <w:rPr>
           <w:rFonts w:ascii="Times New Roman" w:hAnsi="Times New Roman" w:cs="Times New Roman"/>
         </w:rPr>
@@ -224,19 +634,22 @@
     </w:p>
     <w:p>
       <w:pPr>
-        <w:rPr>
-          <w:rFonts w:ascii="Times New Roman" w:hAnsi="Times New Roman" w:cs="Times New Roman"/>
-        </w:rPr>
-      </w:pPr>
-      <w:r>
-        <w:rPr>
-          <w:rFonts w:ascii="Times New Roman" w:hAnsi="Times New Roman" w:cs="Times New Roman"/>
-        </w:rPr>
+        <w:jc w:val="both"/>
+        <w:rPr>
+          <w:rFonts w:ascii="Times New Roman" w:hAnsi="Times New Roman" w:cs="Times New Roman"/>
+        </w:rPr>
+      </w:pPr>
+      <w:r>
+        <w:rPr>
+          <w:rFonts w:ascii="Times New Roman" w:hAnsi="Times New Roman" w:cs="Times New Roman"/>
+        </w:rPr>
+        <w:lastRenderedPageBreak/>
         <w:t>A8. Discover cryptography used in Internet of Things devices.</w:t>
       </w:r>
     </w:p>
     <w:p>
       <w:pPr>
+        <w:jc w:val="both"/>
         <w:rPr>
           <w:rFonts w:ascii="Times New Roman" w:hAnsi="Times New Roman" w:cs="Times New Roman"/>
         </w:rPr>
@@ -250,6 +663,7 @@
     </w:p>
     <w:p>
       <w:pPr>
+        <w:jc w:val="both"/>
         <w:rPr>
           <w:rFonts w:ascii="Times New Roman" w:hAnsi="Times New Roman" w:cs="Times New Roman"/>
         </w:rPr>
@@ -263,6 +677,7 @@
     </w:p>
     <w:p>
       <w:pPr>
+        <w:jc w:val="both"/>
         <w:rPr>
           <w:rFonts w:ascii="Times New Roman" w:hAnsi="Times New Roman" w:cs="Times New Roman"/>
         </w:rPr>
@@ -276,6 +691,7 @@
     </w:p>
     <w:p>
       <w:pPr>
+        <w:jc w:val="both"/>
         <w:rPr>
           <w:rFonts w:ascii="Times New Roman" w:hAnsi="Times New Roman" w:cs="Times New Roman"/>
         </w:rPr>
@@ -289,6 +705,7 @@
     </w:p>
     <w:p>
       <w:pPr>
+        <w:jc w:val="both"/>
         <w:rPr>
           <w:rFonts w:ascii="Times New Roman" w:hAnsi="Times New Roman" w:cs="Times New Roman"/>
         </w:rPr>
@@ -302,6 +719,7 @@
     </w:p>
     <w:p>
       <w:pPr>
+        <w:jc w:val="both"/>
         <w:rPr>
           <w:rFonts w:ascii="Times New Roman" w:hAnsi="Times New Roman" w:cs="Times New Roman"/>
         </w:rPr>
@@ -315,6 +733,7 @@
     </w:p>
     <w:p>
       <w:pPr>
+        <w:jc w:val="both"/>
         <w:rPr>
           <w:rFonts w:ascii="Times New Roman" w:hAnsi="Times New Roman" w:cs="Times New Roman"/>
         </w:rPr>
@@ -328,6 +747,7 @@
     </w:p>
     <w:p>
       <w:pPr>
+        <w:jc w:val="both"/>
         <w:rPr>
           <w:rFonts w:ascii="Times New Roman" w:hAnsi="Times New Roman" w:cs="Times New Roman"/>
         </w:rPr>
@@ -341,6 +761,7 @@
     </w:p>
     <w:p>
       <w:pPr>
+        <w:jc w:val="both"/>
         <w:rPr>
           <w:rFonts w:ascii="Times New Roman" w:hAnsi="Times New Roman" w:cs="Times New Roman"/>
         </w:rPr>
@@ -354,6 +775,7 @@
     </w:p>
     <w:p>
       <w:pPr>
+        <w:jc w:val="both"/>
         <w:rPr>
           <w:rFonts w:ascii="Times New Roman" w:hAnsi="Times New Roman" w:cs="Times New Roman"/>
         </w:rPr>
@@ -367,19 +789,51 @@
     </w:p>
     <w:p>
       <w:pPr>
-        <w:rPr>
-          <w:rFonts w:ascii="Times New Roman" w:hAnsi="Times New Roman" w:cs="Times New Roman"/>
-        </w:rPr>
-      </w:pPr>
-      <w:r>
-        <w:rPr>
-          <w:rFonts w:ascii="Times New Roman" w:hAnsi="Times New Roman" w:cs="Times New Roman"/>
+        <w:jc w:val="both"/>
+        <w:rPr>
+          <w:rFonts w:ascii="Times New Roman" w:hAnsi="Times New Roman" w:cs="Times New Roman"/>
+          <w:b/>
+          <w:bCs/>
+        </w:rPr>
+      </w:pPr>
+      <w:r>
+        <w:rPr>
+          <w:rFonts w:ascii="Times New Roman" w:hAnsi="Times New Roman" w:cs="Times New Roman"/>
+          <w:b/>
+          <w:bCs/>
         </w:rPr>
         <w:t>A19. Join a CS/DS/cybersecurity club.</w:t>
       </w:r>
     </w:p>
     <w:p>
       <w:pPr>
+        <w:jc w:val="both"/>
+        <w:rPr>
+          <w:rFonts w:ascii="Times New Roman" w:hAnsi="Times New Roman" w:cs="Times New Roman"/>
+        </w:rPr>
+      </w:pPr>
+      <w:r>
+        <w:rPr>
+          <w:rFonts w:ascii="Times New Roman" w:hAnsi="Times New Roman" w:cs="Times New Roman"/>
+        </w:rPr>
+        <w:t>I have joined the discord servers of several of UWA’s CS/DS/Cybersecurity clubs, such as Coders For Causes (CFC), Programming Competitive Society (PCS), University Computer Club (UCC)</w:t>
+      </w:r>
+      <w:r>
+        <w:rPr>
+          <w:rFonts w:ascii="Times New Roman" w:hAnsi="Times New Roman" w:cs="Times New Roman"/>
+        </w:rPr>
+        <w:t>, UWA CS/DS, and Computer Science Students’ Club. All evidence of this will be under the directory “A19”</w:t>
+      </w:r>
+      <w:r>
+        <w:rPr>
+          <w:rFonts w:ascii="Times New Roman" w:hAnsi="Times New Roman" w:cs="Times New Roman"/>
+        </w:rPr>
+        <w:t>.</w:t>
+      </w:r>
+    </w:p>
+    <w:p>
+      <w:pPr>
+        <w:jc w:val="both"/>
         <w:rPr>
           <w:rFonts w:ascii="Times New Roman" w:hAnsi="Times New Roman" w:cs="Times New Roman"/>
         </w:rPr>
@@ -393,6 +847,7 @@
     </w:p>
     <w:p>
       <w:pPr>
+        <w:jc w:val="both"/>
         <w:rPr>
           <w:rFonts w:ascii="Times New Roman" w:hAnsi="Times New Roman" w:cs="Times New Roman"/>
         </w:rPr>
@@ -406,6 +861,7 @@
     </w:p>
     <w:p>
       <w:pPr>
+        <w:jc w:val="both"/>
         <w:rPr>
           <w:rFonts w:ascii="Times New Roman" w:hAnsi="Times New Roman" w:cs="Times New Roman"/>
         </w:rPr>
@@ -419,6 +875,7 @@
     </w:p>
     <w:p>
       <w:pPr>
+        <w:jc w:val="both"/>
         <w:rPr>
           <w:rFonts w:ascii="Times New Roman" w:hAnsi="Times New Roman" w:cs="Times New Roman"/>
         </w:rPr>
@@ -432,20 +889,21 @@
     </w:p>
     <w:p>
       <w:pPr>
-        <w:rPr>
-          <w:rFonts w:ascii="Times New Roman" w:hAnsi="Times New Roman" w:cs="Times New Roman"/>
-        </w:rPr>
-      </w:pPr>
-      <w:r>
-        <w:rPr>
-          <w:rFonts w:ascii="Times New Roman" w:hAnsi="Times New Roman" w:cs="Times New Roman"/>
-        </w:rPr>
-        <w:lastRenderedPageBreak/>
+        <w:jc w:val="both"/>
+        <w:rPr>
+          <w:rFonts w:ascii="Times New Roman" w:hAnsi="Times New Roman" w:cs="Times New Roman"/>
+        </w:rPr>
+      </w:pPr>
+      <w:r>
+        <w:rPr>
+          <w:rFonts w:ascii="Times New Roman" w:hAnsi="Times New Roman" w:cs="Times New Roman"/>
+        </w:rPr>
         <w:t>A24. Teach your family about cybersecurity topic of your choice.</w:t>
       </w:r>
     </w:p>
     <w:p>
       <w:pPr>
+        <w:jc w:val="both"/>
         <w:rPr>
           <w:rFonts w:ascii="Times New Roman" w:hAnsi="Times New Roman" w:cs="Times New Roman"/>
         </w:rPr>
@@ -459,6 +917,7 @@
     </w:p>
     <w:p>
       <w:pPr>
+        <w:jc w:val="both"/>
         <w:rPr>
           <w:rFonts w:ascii="Times New Roman" w:hAnsi="Times New Roman" w:cs="Times New Roman"/>
         </w:rPr>
@@ -472,6 +931,7 @@
     </w:p>
     <w:p>
       <w:pPr>
+        <w:jc w:val="both"/>
         <w:rPr>
           <w:rFonts w:ascii="Times New Roman" w:hAnsi="Times New Roman" w:cs="Times New Roman"/>
         </w:rPr>
@@ -485,6 +945,7 @@
     </w:p>
     <w:p>
       <w:pPr>
+        <w:jc w:val="both"/>
         <w:rPr>
           <w:rFonts w:ascii="Times New Roman" w:hAnsi="Times New Roman" w:cs="Times New Roman"/>
         </w:rPr>
@@ -498,6 +959,7 @@
     </w:p>
     <w:p>
       <w:pPr>
+        <w:jc w:val="both"/>
         <w:rPr>
           <w:rFonts w:ascii="Times New Roman" w:hAnsi="Times New Roman" w:cs="Times New Roman"/>
         </w:rPr>
@@ -511,6 +973,7 @@
     </w:p>
     <w:p>
       <w:pPr>
+        <w:jc w:val="both"/>
         <w:rPr>
           <w:rFonts w:ascii="Times New Roman" w:hAnsi="Times New Roman" w:cs="Times New Roman"/>
         </w:rPr>
@@ -1135,6 +1598,7 @@
   <w:style w:type="character" w:default="1" w:styleId="DefaultParagraphFont">
     <w:name w:val="Default Paragraph Font"/>
     <w:uiPriority w:val="1"/>
+    <w:semiHidden/>
     <w:unhideWhenUsed/>
   </w:style>
   <w:style w:type="table" w:default="1" w:styleId="TableNormal">

</xml_diff>